<commit_message>
feat: switch backend to TypeScript/Node.js, add LangGraph/LangChain, add LangSmith observability section
- Tech stack table: backend → TypeScript/Node.js, orchestration → LangGraph (TS), RAG → LangChain (TS), add LangSmith row
- All Python API server references replaced with TypeScript API server
- Section 5.2: API gateway layer updated to TypeScript/Node.js
- Section 5.4.1: Agent Runner now describes LangGraph stateful graph model
- Section 5.4.4: RAG Engine now describes LangChain TS pipeline
- New Section 10: LangSmith Observability — trace table, UI token/cost display table, integration notes
- MongoDB agent_runs collection: added input_tokens, output_tokens, cost_usd, langsmith_trace_id fields
- Folder structure: backend updated to TypeScript (.ts), added observability/ module
- Phase 1 & 2 roadmap deliverables updated to reflect new stack
- Sections renumbered: Roadmap→11, Security→12, Next Steps→13

Co-Authored-By: Claude Sonnet 4.6 <noreply@anthropic.com>
</commit_message>
<xml_diff>
--- a/AI Workbench Architecture.docx
+++ b/AI Workbench Architecture.docx
@@ -747,7 +747,7 @@
           </w:tcPr>
           <w:p>
             <w:r>
-              <w:t xml:space="preserve">Python</w:t>
+              <w:t xml:space="preserve">TypeScript / Node.js</w:t>
             </w:r>
           </w:p>
         </w:tc>
@@ -770,7 +770,7 @@
           </w:tcPr>
           <w:p>
             <w:r>
-              <w:t xml:space="preserve">Best ecosystem for AI/ML workloads; async-capable; serves both web and desktop clients.</w:t>
+              <w:t xml:space="preserve">Strongly typed; same language across backend and frontend; async-native; serves both web and desktop clients.</w:t>
             </w:r>
           </w:p>
         </w:tc>
@@ -960,7 +960,7 @@
           </w:tcPr>
           <w:p>
             <w:r>
-              <w:t xml:space="preserve">LLM Gateway (e.g. LiteLLM)</w:t>
+              <w:t xml:space="preserve">LiteLLM</w:t>
             </w:r>
           </w:p>
         </w:tc>
@@ -1031,7 +1031,7 @@
           </w:tcPr>
           <w:p>
             <w:r>
-              <w:t xml:space="preserve">Custom Agent Runner</w:t>
+              <w:t xml:space="preserve">LangGraph (TypeScript)</w:t>
             </w:r>
           </w:p>
         </w:tc>
@@ -1054,7 +1054,7 @@
           </w:tcPr>
           <w:p>
             <w:r>
-              <w:t xml:space="preserve">Full control over execution strategy; plug-and-play agent types.</w:t>
+              <w:t xml:space="preserve">Graph-based stateful agent execution; supports ReAct, Plan-and-Execute, and custom multi-step workflows.</w:t>
             </w:r>
           </w:p>
         </w:tc>
@@ -1102,7 +1102,7 @@
           </w:tcPr>
           <w:p>
             <w:r>
-              <w:t xml:space="preserve">RAG Framework (e.g. LlamaIndex)</w:t>
+              <w:t xml:space="preserve">LangChain (TypeScript)</w:t>
             </w:r>
           </w:p>
         </w:tc>
@@ -1125,7 +1125,7 @@
           </w:tcPr>
           <w:p>
             <w:r>
-              <w:t xml:space="preserve">Handles document ingestion, chunking, embedding, and retrieval.</w:t>
+              <w:t xml:space="preserve">Handles document ingestion, chunking, embedding, and retrieval; composable pipeline design.</w:t>
             </w:r>
           </w:p>
         </w:tc>
@@ -1150,6 +1150,77 @@
           </w:tcPr>
           <w:p>
             <w:r>
+              <w:t xml:space="preserve">Observability</w:t>
+            </w:r>
+          </w:p>
+        </w:tc>
+        <w:tc>
+          <w:tcPr>
+            <w:tcW w:type="dxa" w:w="2800"/>
+            <w:tcBorders>
+              <w:top w:val="single" w:color="CCCCCC" w:sz="1"/>
+              <w:left w:val="single" w:color="CCCCCC" w:sz="1"/>
+              <w:bottom w:val="single" w:color="CCCCCC" w:sz="1"/>
+              <w:right w:val="single" w:color="CCCCCC" w:sz="1"/>
+            </w:tcBorders>
+            <w:shd w:fill="F0F4FA" w:val="clear"/>
+            <w:tcMar>
+              <w:top w:type="dxa" w:w="80"/>
+              <w:left w:type="dxa" w:w="120"/>
+              <w:bottom w:type="dxa" w:w="80"/>
+              <w:right w:type="dxa" w:w="120"/>
+            </w:tcMar>
+          </w:tcPr>
+          <w:p>
+            <w:r>
+              <w:t xml:space="preserve">LangSmith</w:t>
+            </w:r>
+          </w:p>
+        </w:tc>
+        <w:tc>
+          <w:tcPr>
+            <w:tcW w:type="dxa" w:w="4360"/>
+            <w:tcBorders>
+              <w:top w:val="single" w:color="CCCCCC" w:sz="1"/>
+              <w:left w:val="single" w:color="CCCCCC" w:sz="1"/>
+              <w:bottom w:val="single" w:color="CCCCCC" w:sz="1"/>
+              <w:right w:val="single" w:color="CCCCCC" w:sz="1"/>
+            </w:tcBorders>
+            <w:shd w:fill="F0F4FA" w:val="clear"/>
+            <w:tcMar>
+              <w:top w:type="dxa" w:w="80"/>
+              <w:left w:type="dxa" w:w="120"/>
+              <w:bottom w:type="dxa" w:w="80"/>
+              <w:right w:type="dxa" w:w="120"/>
+            </w:tcMar>
+          </w:tcPr>
+          <w:p>
+            <w:r>
+              <w:t xml:space="preserve">End-to-end tracing of every agent run; tracks input tokens, output tokens, and cost per request.</w:t>
+            </w:r>
+          </w:p>
+        </w:tc>
+      </w:tr>
+      <w:tr>
+        <w:tc>
+          <w:tcPr>
+            <w:tcW w:type="dxa" w:w="2200"/>
+            <w:tcBorders>
+              <w:top w:val="single" w:color="CCCCCC" w:sz="1"/>
+              <w:left w:val="single" w:color="CCCCCC" w:sz="1"/>
+              <w:bottom w:val="single" w:color="CCCCCC" w:sz="1"/>
+              <w:right w:val="single" w:color="CCCCCC" w:sz="1"/>
+            </w:tcBorders>
+            <w:shd w:fill="FFFFFF" w:val="clear"/>
+            <w:tcMar>
+              <w:top w:type="dxa" w:w="80"/>
+              <w:left w:type="dxa" w:w="120"/>
+              <w:bottom w:type="dxa" w:w="80"/>
+              <w:right w:type="dxa" w:w="120"/>
+            </w:tcMar>
+          </w:tcPr>
+          <w:p>
+            <w:r>
               <w:t xml:space="preserve">Vector + document store</w:t>
             </w:r>
           </w:p>
@@ -1163,7 +1234,7 @@
               <w:bottom w:val="single" w:color="CCCCCC" w:sz="1"/>
               <w:right w:val="single" w:color="CCCCCC" w:sz="1"/>
             </w:tcBorders>
-            <w:shd w:fill="F0F4FA" w:val="clear"/>
+            <w:shd w:fill="FFFFFF" w:val="clear"/>
             <w:tcMar>
               <w:top w:type="dxa" w:w="80"/>
               <w:left w:type="dxa" w:w="120"/>
@@ -1186,7 +1257,7 @@
               <w:bottom w:val="single" w:color="CCCCCC" w:sz="1"/>
               <w:right w:val="single" w:color="CCCCCC" w:sz="1"/>
             </w:tcBorders>
-            <w:shd w:fill="F0F4FA" w:val="clear"/>
+            <w:shd w:fill="FFFFFF" w:val="clear"/>
             <w:tcMar>
               <w:top w:type="dxa" w:w="80"/>
               <w:left w:type="dxa" w:w="120"/>
@@ -1211,7 +1282,7 @@
               <w:bottom w:val="single" w:color="CCCCCC" w:sz="1"/>
               <w:right w:val="single" w:color="CCCCCC" w:sz="1"/>
             </w:tcBorders>
-            <w:shd w:fill="FFFFFF" w:val="clear"/>
+            <w:shd w:fill="F0F4FA" w:val="clear"/>
             <w:tcMar>
               <w:top w:type="dxa" w:w="80"/>
               <w:left w:type="dxa" w:w="120"/>
@@ -1234,7 +1305,7 @@
               <w:bottom w:val="single" w:color="CCCCCC" w:sz="1"/>
               <w:right w:val="single" w:color="CCCCCC" w:sz="1"/>
             </w:tcBorders>
-            <w:shd w:fill="FFFFFF" w:val="clear"/>
+            <w:shd w:fill="F0F4FA" w:val="clear"/>
             <w:tcMar>
               <w:top w:type="dxa" w:w="80"/>
               <w:left w:type="dxa" w:w="120"/>
@@ -1257,7 +1328,7 @@
               <w:bottom w:val="single" w:color="CCCCCC" w:sz="1"/>
               <w:right w:val="single" w:color="CCCCCC" w:sz="1"/>
             </w:tcBorders>
-            <w:shd w:fill="FFFFFF" w:val="clear"/>
+            <w:shd w:fill="F0F4FA" w:val="clear"/>
             <w:tcMar>
               <w:top w:type="dxa" w:w="80"/>
               <w:left w:type="dxa" w:w="120"/>
@@ -1282,7 +1353,7 @@
               <w:bottom w:val="single" w:color="CCCCCC" w:sz="1"/>
               <w:right w:val="single" w:color="CCCCCC" w:sz="1"/>
             </w:tcBorders>
-            <w:shd w:fill="F0F4FA" w:val="clear"/>
+            <w:shd w:fill="FFFFFF" w:val="clear"/>
             <w:tcMar>
               <w:top w:type="dxa" w:w="80"/>
               <w:left w:type="dxa" w:w="120"/>
@@ -1305,7 +1376,7 @@
               <w:bottom w:val="single" w:color="CCCCCC" w:sz="1"/>
               <w:right w:val="single" w:color="CCCCCC" w:sz="1"/>
             </w:tcBorders>
-            <w:shd w:fill="F0F4FA" w:val="clear"/>
+            <w:shd w:fill="FFFFFF" w:val="clear"/>
             <w:tcMar>
               <w:top w:type="dxa" w:w="80"/>
               <w:left w:type="dxa" w:w="120"/>
@@ -1328,7 +1399,7 @@
               <w:bottom w:val="single" w:color="CCCCCC" w:sz="1"/>
               <w:right w:val="single" w:color="CCCCCC" w:sz="1"/>
             </w:tcBorders>
-            <w:shd w:fill="F0F4FA" w:val="clear"/>
+            <w:shd w:fill="FFFFFF" w:val="clear"/>
             <w:tcMar>
               <w:top w:type="dxa" w:w="80"/>
               <w:left w:type="dxa" w:w="120"/>
@@ -1353,7 +1424,7 @@
               <w:bottom w:val="single" w:color="CCCCCC" w:sz="1"/>
               <w:right w:val="single" w:color="CCCCCC" w:sz="1"/>
             </w:tcBorders>
-            <w:shd w:fill="FFFFFF" w:val="clear"/>
+            <w:shd w:fill="F0F4FA" w:val="clear"/>
             <w:tcMar>
               <w:top w:type="dxa" w:w="80"/>
               <w:left w:type="dxa" w:w="120"/>
@@ -1376,17 +1447,17 @@
               <w:bottom w:val="single" w:color="CCCCCC" w:sz="1"/>
               <w:right w:val="single" w:color="CCCCCC" w:sz="1"/>
             </w:tcBorders>
-            <w:shd w:fill="FFFFFF" w:val="clear"/>
-            <w:tcMar>
-              <w:top w:type="dxa" w:w="80"/>
-              <w:left w:type="dxa" w:w="120"/>
-              <w:bottom w:type="dxa" w:w="80"/>
-              <w:right w:type="dxa" w:w="120"/>
-            </w:tcMar>
-          </w:tcPr>
-          <w:p>
-            <w:r>
-              <w:t xml:space="preserve">Message Queue (e.g. Redis / Celery)</w:t>
+            <w:shd w:fill="F0F4FA" w:val="clear"/>
+            <w:tcMar>
+              <w:top w:type="dxa" w:w="80"/>
+              <w:left w:type="dxa" w:w="120"/>
+              <w:bottom w:type="dxa" w:w="80"/>
+              <w:right w:type="dxa" w:w="120"/>
+            </w:tcMar>
+          </w:tcPr>
+          <w:p>
+            <w:r>
+              <w:t xml:space="preserve">Message Queue (e.g. Redis)</w:t>
             </w:r>
           </w:p>
         </w:tc>
@@ -1399,7 +1470,7 @@
               <w:bottom w:val="single" w:color="CCCCCC" w:sz="1"/>
               <w:right w:val="single" w:color="CCCCCC" w:sz="1"/>
             </w:tcBorders>
-            <w:shd w:fill="FFFFFF" w:val="clear"/>
+            <w:shd w:fill="F0F4FA" w:val="clear"/>
             <w:tcMar>
               <w:top w:type="dxa" w:w="80"/>
               <w:left w:type="dxa" w:w="120"/>
@@ -1424,7 +1495,7 @@
               <w:bottom w:val="single" w:color="CCCCCC" w:sz="1"/>
               <w:right w:val="single" w:color="CCCCCC" w:sz="1"/>
             </w:tcBorders>
-            <w:shd w:fill="F0F4FA" w:val="clear"/>
+            <w:shd w:fill="FFFFFF" w:val="clear"/>
             <w:tcMar>
               <w:top w:type="dxa" w:w="80"/>
               <w:left w:type="dxa" w:w="120"/>
@@ -1447,7 +1518,7 @@
               <w:bottom w:val="single" w:color="CCCCCC" w:sz="1"/>
               <w:right w:val="single" w:color="CCCCCC" w:sz="1"/>
             </w:tcBorders>
-            <w:shd w:fill="F0F4FA" w:val="clear"/>
+            <w:shd w:fill="FFFFFF" w:val="clear"/>
             <w:tcMar>
               <w:top w:type="dxa" w:w="80"/>
               <w:left w:type="dxa" w:w="120"/>
@@ -1470,7 +1541,7 @@
               <w:bottom w:val="single" w:color="CCCCCC" w:sz="1"/>
               <w:right w:val="single" w:color="CCCCCC" w:sz="1"/>
             </w:tcBorders>
-            <w:shd w:fill="F0F4FA" w:val="clear"/>
+            <w:shd w:fill="FFFFFF" w:val="clear"/>
             <w:tcMar>
               <w:top w:type="dxa" w:w="80"/>
               <w:left w:type="dxa" w:w="120"/>
@@ -1495,7 +1566,7 @@
               <w:bottom w:val="single" w:color="CCCCCC" w:sz="1"/>
               <w:right w:val="single" w:color="CCCCCC" w:sz="1"/>
             </w:tcBorders>
-            <w:shd w:fill="FFFFFF" w:val="clear"/>
+            <w:shd w:fill="F0F4FA" w:val="clear"/>
             <w:tcMar>
               <w:top w:type="dxa" w:w="80"/>
               <w:left w:type="dxa" w:w="120"/>
@@ -1518,7 +1589,7 @@
               <w:bottom w:val="single" w:color="CCCCCC" w:sz="1"/>
               <w:right w:val="single" w:color="CCCCCC" w:sz="1"/>
             </w:tcBorders>
-            <w:shd w:fill="FFFFFF" w:val="clear"/>
+            <w:shd w:fill="F0F4FA" w:val="clear"/>
             <w:tcMar>
               <w:top w:type="dxa" w:w="80"/>
               <w:left w:type="dxa" w:w="120"/>
@@ -1541,7 +1612,7 @@
               <w:bottom w:val="single" w:color="CCCCCC" w:sz="1"/>
               <w:right w:val="single" w:color="CCCCCC" w:sz="1"/>
             </w:tcBorders>
-            <w:shd w:fill="FFFFFF" w:val="clear"/>
+            <w:shd w:fill="F0F4FA" w:val="clear"/>
             <w:tcMar>
               <w:top w:type="dxa" w:w="80"/>
               <w:left w:type="dxa" w:w="120"/>
@@ -1769,7 +1840,7 @@
           </w:tcPr>
           <w:p>
             <w:r>
-              <w:t xml:space="preserve">Python API server — OSS2 container, cloud or self-hosted</w:t>
+              <w:t xml:space="preserve">TypeScript API server (Node.js) — OSS2 container, cloud or self-hosted</w:t>
             </w:r>
           </w:p>
         </w:tc>
@@ -2158,7 +2229,7 @@
           </w:tcPr>
           <w:p>
             <w:r>
-              <w:t xml:space="preserve">Python API server running locally, started by the desktop shell</w:t>
+              <w:t xml:space="preserve">TypeScript API server (Node.js) running locally, started by the desktop shell</w:t>
             </w:r>
           </w:p>
         </w:tc>
@@ -2729,7 +2800,7 @@
           </w:tcPr>
           <w:p>
             <w:r>
-              <w:t xml:space="preserve">Python backend — REST endpoints, WebSocket streaming, auth middleware, rate limiting.</w:t>
+              <w:t xml:space="preserve">TypeScript / Node.js backend — REST endpoints, WebSocket streaming, auth middleware, rate limiting.</w:t>
             </w:r>
           </w:p>
         </w:tc>
@@ -2979,7 +3050,7 @@
     </w:p>
     <w:p>
       <w:r>
-        <w:t xml:space="preserve">The execution engine. Accepts a task and skill, assembles context from RAG and memory, calls the LLM via the LLM Gateway, and loops on tool calls until a final response is ready. Supports multiple agent strategies such as ReAct and Plan-and-Execute.</w:t>
+        <w:t xml:space="preserve">The execution engine, implemented using LangGraph (TypeScript). Each agent run is modelled as a stateful directed graph: nodes represent steps (context assembly, LLM call, tool dispatch, memory update) and edges encode decision logic. LangGraph's built-in checkpointing allows runs to be paused, resumed, and inspected. Supports multiple agent strategies including ReAct and Plan-and-Execute, each implemented as a different graph topology.</w:t>
       </w:r>
     </w:p>
     <w:p>
@@ -3027,7 +3098,7 @@
     </w:p>
     <w:p>
       <w:r>
-        <w:t xml:space="preserve">Ingests documents by chunking, embedding, and storing them in MongoDB. At query time, retrieves the most relevant chunks by vector similarity and injects them into the agent context. Supports multiple named knowledge bases.</w:t>
+        <w:t xml:space="preserve">Built on LangChain (TypeScript). Ingests documents by splitting them into chunks, generating embeddings, and storing them in MongoDB Atlas Vector Search. At query time, retrieves the most relevant chunks by cosine similarity and injects them into the agent context. LangChain's document loader and text splitter abstractions mean new file formats (PDF, DOCX, HTML, web pages) can be added with a single loader registration. Supports multiple named knowledge bases within the same MongoDB instance.</w:t>
       </w:r>
     </w:p>
     <w:p>
@@ -3099,7 +3170,7 @@
           <w:sz w:val="18"/>
           <w:szCs w:val="18"/>
         </w:rPr>
-        <w:t xml:space="preserve">├── backend/                    # Python API server (shared by web + desktop)</w:t>
+        <w:t xml:space="preserve">├── backend/                    # TypeScript API server (shared by web + desktop)</w:t>
       </w:r>
     </w:p>
     <w:p>
@@ -3109,7 +3180,7 @@
           <w:sz w:val="18"/>
           <w:szCs w:val="18"/>
         </w:rPr>
-        <w:t xml:space="preserve">│   ├── core/                   # Agent runner, skill registry, MCP registry</w:t>
+        <w:t xml:space="preserve">│   ├── src/</w:t>
       </w:r>
     </w:p>
     <w:p>
@@ -3119,7 +3190,7 @@
           <w:sz w:val="18"/>
           <w:szCs w:val="18"/>
         </w:rPr>
-        <w:t xml:space="preserve">│   ├── skills/                 # Plug-and-play skill modules</w:t>
+        <w:t xml:space="preserve">│   │   ├── core/               # Agent runner (LangGraph), skill registry, MCP registry</w:t>
       </w:r>
     </w:p>
     <w:p>
@@ -3129,7 +3200,7 @@
           <w:sz w:val="18"/>
           <w:szCs w:val="18"/>
         </w:rPr>
-        <w:t xml:space="preserve">│   ├── rag/                    # RAG ingestion and retrieval</w:t>
+        <w:t xml:space="preserve">│   │   ├── skills/             # Plug-and-play skill modules (.ts)</w:t>
       </w:r>
     </w:p>
     <w:p>
@@ -3139,7 +3210,7 @@
           <w:sz w:val="18"/>
           <w:szCs w:val="18"/>
         </w:rPr>
-        <w:t xml:space="preserve">│   ├── memory/                 # Short-term, long-term, entity memory</w:t>
+        <w:t xml:space="preserve">│   │   ├── rag/                # RAG ingestion and retrieval (LangChain)</w:t>
       </w:r>
     </w:p>
     <w:p>
@@ -3149,7 +3220,7 @@
           <w:sz w:val="18"/>
           <w:szCs w:val="18"/>
         </w:rPr>
-        <w:t xml:space="preserve">│   ├── api/                    # API route handlers</w:t>
+        <w:t xml:space="preserve">│   │   ├── memory/             # Short-term, long-term, entity memory</w:t>
       </w:r>
     </w:p>
     <w:p>
@@ -3159,7 +3230,47 @@
           <w:sz w:val="18"/>
           <w:szCs w:val="18"/>
         </w:rPr>
-        <w:t xml:space="preserve">│   └── db/                     # Database connection and helpers</w:t>
+        <w:t xml:space="preserve">│   │   ├── api/                # API route handlers</w:t>
+      </w:r>
+    </w:p>
+    <w:p>
+      <w:r>
+        <w:rPr>
+          <w:rFonts w:ascii="Courier New" w:cs="Courier New" w:eastAsia="Courier New" w:hAnsi="Courier New"/>
+          <w:sz w:val="18"/>
+          <w:szCs w:val="18"/>
+        </w:rPr>
+        <w:t xml:space="preserve">│   │   ├── observability/      # LangSmith tracing + token/cost tracking</w:t>
+      </w:r>
+    </w:p>
+    <w:p>
+      <w:r>
+        <w:rPr>
+          <w:rFonts w:ascii="Courier New" w:cs="Courier New" w:eastAsia="Courier New" w:hAnsi="Courier New"/>
+          <w:sz w:val="18"/>
+          <w:szCs w:val="18"/>
+        </w:rPr>
+        <w:t xml:space="preserve">│   │   └── db/                 # MongoDB connection and helpers</w:t>
+      </w:r>
+    </w:p>
+    <w:p>
+      <w:r>
+        <w:rPr>
+          <w:rFonts w:ascii="Courier New" w:cs="Courier New" w:eastAsia="Courier New" w:hAnsi="Courier New"/>
+          <w:sz w:val="18"/>
+          <w:szCs w:val="18"/>
+        </w:rPr>
+        <w:t xml:space="preserve">│   ├── package.json</w:t>
+      </w:r>
+    </w:p>
+    <w:p>
+      <w:r>
+        <w:rPr>
+          <w:rFonts w:ascii="Courier New" w:cs="Courier New" w:eastAsia="Courier New" w:hAnsi="Courier New"/>
+          <w:sz w:val="18"/>
+          <w:szCs w:val="18"/>
+        </w:rPr>
+        <w:t xml:space="preserve">│   └── tsconfig.json</w:t>
       </w:r>
     </w:p>
     <w:p>
@@ -3913,7 +4024,7 @@
           </w:tcPr>
           <w:p>
             <w:r>
-              <w:t xml:space="preserve">run_id, skill, steps[], input, output, duration, status</w:t>
+              <w:t xml:space="preserve">run_id, skill, steps[], input, output, duration, status, input_tokens, output_tokens, cost_usd, langsmith_trace_id</w:t>
             </w:r>
           </w:p>
         </w:tc>
@@ -4759,7 +4870,870 @@
         <w:rPr>
           <w:color w:val="1F4E79"/>
         </w:rPr>
-        <w:t xml:space="preserve">10. Implementation Roadmap</w:t>
+        <w:t xml:space="preserve">10. Observability with LangSmith</w:t>
+      </w:r>
+    </w:p>
+    <w:p>
+      <w:r>
+        <w:t xml:space="preserve">Every agent run is automatically traced through LangSmith, giving the team a complete audit trail of each request and clear visibility into model usage and cost. LangSmith is configured via environment variables — no code changes are needed to enable or disable tracing.</w:t>
+      </w:r>
+    </w:p>
+    <w:p>
+      <w:r>
+        <w:t xml:space="preserve"/>
+      </w:r>
+    </w:p>
+    <w:p>
+      <w:pPr>
+        <w:pStyle w:val="Heading2"/>
+      </w:pPr>
+      <w:r>
+        <w:rPr>
+          <w:color w:val="2E75B6"/>
+        </w:rPr>
+        <w:t xml:space="preserve">10.1 What LangSmith Captures</w:t>
+      </w:r>
+    </w:p>
+    <w:tbl>
+      <w:tblPr>
+        <w:tblW w:type="dxa" w:w="9400"/>
+        <w:tblBorders>
+          <w:top w:val="single" w:color="auto" w:sz="4"/>
+          <w:left w:val="single" w:color="auto" w:sz="4"/>
+          <w:bottom w:val="single" w:color="auto" w:sz="4"/>
+          <w:right w:val="single" w:color="auto" w:sz="4"/>
+          <w:insideH w:val="single" w:color="auto" w:sz="4"/>
+          <w:insideV w:val="single" w:color="auto" w:sz="4"/>
+        </w:tblBorders>
+      </w:tblPr>
+      <w:tblGrid>
+        <w:gridCol w:w="2400"/>
+        <w:gridCol w:w="7000"/>
+      </w:tblGrid>
+      <w:tr>
+        <w:tc>
+          <w:tcPr>
+            <w:tcW w:type="dxa" w:w="2400"/>
+            <w:tcBorders>
+              <w:top w:val="single" w:color="1F4E79" w:sz="1"/>
+              <w:left w:val="single" w:color="1F4E79" w:sz="1"/>
+              <w:bottom w:val="single" w:color="1F4E79" w:sz="1"/>
+              <w:right w:val="single" w:color="1F4E79" w:sz="1"/>
+            </w:tcBorders>
+            <w:shd w:fill="1F4E79" w:val="clear"/>
+            <w:tcMar>
+              <w:top w:type="dxa" w:w="80"/>
+              <w:left w:type="dxa" w:w="120"/>
+              <w:bottom w:type="dxa" w:w="80"/>
+              <w:right w:type="dxa" w:w="120"/>
+            </w:tcMar>
+          </w:tcPr>
+          <w:p>
+            <w:r>
+              <w:rPr>
+                <w:b/>
+                <w:bCs/>
+                <w:color w:val="FFFFFF"/>
+              </w:rPr>
+              <w:t xml:space="preserve">Signal</w:t>
+            </w:r>
+          </w:p>
+        </w:tc>
+        <w:tc>
+          <w:tcPr>
+            <w:tcW w:type="dxa" w:w="7000"/>
+            <w:tcBorders>
+              <w:top w:val="single" w:color="1F4E79" w:sz="1"/>
+              <w:left w:val="single" w:color="1F4E79" w:sz="1"/>
+              <w:bottom w:val="single" w:color="1F4E79" w:sz="1"/>
+              <w:right w:val="single" w:color="1F4E79" w:sz="1"/>
+            </w:tcBorders>
+            <w:shd w:fill="1F4E79" w:val="clear"/>
+            <w:tcMar>
+              <w:top w:type="dxa" w:w="80"/>
+              <w:left w:type="dxa" w:w="120"/>
+              <w:bottom w:type="dxa" w:w="80"/>
+              <w:right w:type="dxa" w:w="120"/>
+            </w:tcMar>
+          </w:tcPr>
+          <w:p>
+            <w:r>
+              <w:rPr>
+                <w:b/>
+                <w:bCs/>
+                <w:color w:val="FFFFFF"/>
+              </w:rPr>
+              <w:t xml:space="preserve">Description</w:t>
+            </w:r>
+          </w:p>
+        </w:tc>
+      </w:tr>
+      <w:tr>
+        <w:tc>
+          <w:tcPr>
+            <w:tcW w:type="dxa" w:w="2400"/>
+            <w:tcBorders>
+              <w:top w:val="single" w:color="CCCCCC" w:sz="1"/>
+              <w:left w:val="single" w:color="CCCCCC" w:sz="1"/>
+              <w:bottom w:val="single" w:color="CCCCCC" w:sz="1"/>
+              <w:right w:val="single" w:color="CCCCCC" w:sz="1"/>
+            </w:tcBorders>
+            <w:shd w:fill="F0F4FA" w:val="clear"/>
+            <w:tcMar>
+              <w:top w:type="dxa" w:w="80"/>
+              <w:left w:type="dxa" w:w="120"/>
+              <w:bottom w:type="dxa" w:w="80"/>
+              <w:right w:type="dxa" w:w="120"/>
+            </w:tcMar>
+          </w:tcPr>
+          <w:p>
+            <w:r>
+              <w:t xml:space="preserve">Trace</w:t>
+            </w:r>
+          </w:p>
+        </w:tc>
+        <w:tc>
+          <w:tcPr>
+            <w:tcW w:type="dxa" w:w="7000"/>
+            <w:tcBorders>
+              <w:top w:val="single" w:color="CCCCCC" w:sz="1"/>
+              <w:left w:val="single" w:color="CCCCCC" w:sz="1"/>
+              <w:bottom w:val="single" w:color="CCCCCC" w:sz="1"/>
+              <w:right w:val="single" w:color="CCCCCC" w:sz="1"/>
+            </w:tcBorders>
+            <w:shd w:fill="F0F4FA" w:val="clear"/>
+            <w:tcMar>
+              <w:top w:type="dxa" w:w="80"/>
+              <w:left w:type="dxa" w:w="120"/>
+              <w:bottom w:type="dxa" w:w="80"/>
+              <w:right w:type="dxa" w:w="120"/>
+            </w:tcMar>
+          </w:tcPr>
+          <w:p>
+            <w:r>
+              <w:t xml:space="preserve">Full execution graph of the agent run: each LangGraph node, its inputs, outputs, and duration.</w:t>
+            </w:r>
+          </w:p>
+        </w:tc>
+      </w:tr>
+      <w:tr>
+        <w:tc>
+          <w:tcPr>
+            <w:tcW w:type="dxa" w:w="2400"/>
+            <w:tcBorders>
+              <w:top w:val="single" w:color="CCCCCC" w:sz="1"/>
+              <w:left w:val="single" w:color="CCCCCC" w:sz="1"/>
+              <w:bottom w:val="single" w:color="CCCCCC" w:sz="1"/>
+              <w:right w:val="single" w:color="CCCCCC" w:sz="1"/>
+            </w:tcBorders>
+            <w:shd w:fill="FFFFFF" w:val="clear"/>
+            <w:tcMar>
+              <w:top w:type="dxa" w:w="80"/>
+              <w:left w:type="dxa" w:w="120"/>
+              <w:bottom w:type="dxa" w:w="80"/>
+              <w:right w:type="dxa" w:w="120"/>
+            </w:tcMar>
+          </w:tcPr>
+          <w:p>
+            <w:r>
+              <w:t xml:space="preserve">LLM calls</w:t>
+            </w:r>
+          </w:p>
+        </w:tc>
+        <w:tc>
+          <w:tcPr>
+            <w:tcW w:type="dxa" w:w="7000"/>
+            <w:tcBorders>
+              <w:top w:val="single" w:color="CCCCCC" w:sz="1"/>
+              <w:left w:val="single" w:color="CCCCCC" w:sz="1"/>
+              <w:bottom w:val="single" w:color="CCCCCC" w:sz="1"/>
+              <w:right w:val="single" w:color="CCCCCC" w:sz="1"/>
+            </w:tcBorders>
+            <w:shd w:fill="FFFFFF" w:val="clear"/>
+            <w:tcMar>
+              <w:top w:type="dxa" w:w="80"/>
+              <w:left w:type="dxa" w:w="120"/>
+              <w:bottom w:type="dxa" w:w="80"/>
+              <w:right w:type="dxa" w:w="120"/>
+            </w:tcMar>
+          </w:tcPr>
+          <w:p>
+            <w:r>
+              <w:t xml:space="preserve">Every call to the LLM provider: model name, prompt sent, response received, and latency.</w:t>
+            </w:r>
+          </w:p>
+        </w:tc>
+      </w:tr>
+      <w:tr>
+        <w:tc>
+          <w:tcPr>
+            <w:tcW w:type="dxa" w:w="2400"/>
+            <w:tcBorders>
+              <w:top w:val="single" w:color="CCCCCC" w:sz="1"/>
+              <w:left w:val="single" w:color="CCCCCC" w:sz="1"/>
+              <w:bottom w:val="single" w:color="CCCCCC" w:sz="1"/>
+              <w:right w:val="single" w:color="CCCCCC" w:sz="1"/>
+            </w:tcBorders>
+            <w:shd w:fill="F0F4FA" w:val="clear"/>
+            <w:tcMar>
+              <w:top w:type="dxa" w:w="80"/>
+              <w:left w:type="dxa" w:w="120"/>
+              <w:bottom w:type="dxa" w:w="80"/>
+              <w:right w:type="dxa" w:w="120"/>
+            </w:tcMar>
+          </w:tcPr>
+          <w:p>
+            <w:r>
+              <w:t xml:space="preserve">Input tokens</w:t>
+            </w:r>
+          </w:p>
+        </w:tc>
+        <w:tc>
+          <w:tcPr>
+            <w:tcW w:type="dxa" w:w="7000"/>
+            <w:tcBorders>
+              <w:top w:val="single" w:color="CCCCCC" w:sz="1"/>
+              <w:left w:val="single" w:color="CCCCCC" w:sz="1"/>
+              <w:bottom w:val="single" w:color="CCCCCC" w:sz="1"/>
+              <w:right w:val="single" w:color="CCCCCC" w:sz="1"/>
+            </w:tcBorders>
+            <w:shd w:fill="F0F4FA" w:val="clear"/>
+            <w:tcMar>
+              <w:top w:type="dxa" w:w="80"/>
+              <w:left w:type="dxa" w:w="120"/>
+              <w:bottom w:type="dxa" w:w="80"/>
+              <w:right w:type="dxa" w:w="120"/>
+            </w:tcMar>
+          </w:tcPr>
+          <w:p>
+            <w:r>
+              <w:t xml:space="preserve">Number of tokens in the combined prompt (system prompt + RAG context + conversation history + user message).</w:t>
+            </w:r>
+          </w:p>
+        </w:tc>
+      </w:tr>
+      <w:tr>
+        <w:tc>
+          <w:tcPr>
+            <w:tcW w:type="dxa" w:w="2400"/>
+            <w:tcBorders>
+              <w:top w:val="single" w:color="CCCCCC" w:sz="1"/>
+              <w:left w:val="single" w:color="CCCCCC" w:sz="1"/>
+              <w:bottom w:val="single" w:color="CCCCCC" w:sz="1"/>
+              <w:right w:val="single" w:color="CCCCCC" w:sz="1"/>
+            </w:tcBorders>
+            <w:shd w:fill="FFFFFF" w:val="clear"/>
+            <w:tcMar>
+              <w:top w:type="dxa" w:w="80"/>
+              <w:left w:type="dxa" w:w="120"/>
+              <w:bottom w:type="dxa" w:w="80"/>
+              <w:right w:type="dxa" w:w="120"/>
+            </w:tcMar>
+          </w:tcPr>
+          <w:p>
+            <w:r>
+              <w:t xml:space="preserve">Output tokens</w:t>
+            </w:r>
+          </w:p>
+        </w:tc>
+        <w:tc>
+          <w:tcPr>
+            <w:tcW w:type="dxa" w:w="7000"/>
+            <w:tcBorders>
+              <w:top w:val="single" w:color="CCCCCC" w:sz="1"/>
+              <w:left w:val="single" w:color="CCCCCC" w:sz="1"/>
+              <w:bottom w:val="single" w:color="CCCCCC" w:sz="1"/>
+              <w:right w:val="single" w:color="CCCCCC" w:sz="1"/>
+            </w:tcBorders>
+            <w:shd w:fill="FFFFFF" w:val="clear"/>
+            <w:tcMar>
+              <w:top w:type="dxa" w:w="80"/>
+              <w:left w:type="dxa" w:w="120"/>
+              <w:bottom w:type="dxa" w:w="80"/>
+              <w:right w:type="dxa" w:w="120"/>
+            </w:tcMar>
+          </w:tcPr>
+          <w:p>
+            <w:r>
+              <w:t xml:space="preserve">Number of tokens in the model’s response.</w:t>
+            </w:r>
+          </w:p>
+        </w:tc>
+      </w:tr>
+      <w:tr>
+        <w:tc>
+          <w:tcPr>
+            <w:tcW w:type="dxa" w:w="2400"/>
+            <w:tcBorders>
+              <w:top w:val="single" w:color="CCCCCC" w:sz="1"/>
+              <w:left w:val="single" w:color="CCCCCC" w:sz="1"/>
+              <w:bottom w:val="single" w:color="CCCCCC" w:sz="1"/>
+              <w:right w:val="single" w:color="CCCCCC" w:sz="1"/>
+            </w:tcBorders>
+            <w:shd w:fill="F0F4FA" w:val="clear"/>
+            <w:tcMar>
+              <w:top w:type="dxa" w:w="80"/>
+              <w:left w:type="dxa" w:w="120"/>
+              <w:bottom w:type="dxa" w:w="80"/>
+              <w:right w:type="dxa" w:w="120"/>
+            </w:tcMar>
+          </w:tcPr>
+          <w:p>
+            <w:r>
+              <w:t xml:space="preserve">Total tokens</w:t>
+            </w:r>
+          </w:p>
+        </w:tc>
+        <w:tc>
+          <w:tcPr>
+            <w:tcW w:type="dxa" w:w="7000"/>
+            <w:tcBorders>
+              <w:top w:val="single" w:color="CCCCCC" w:sz="1"/>
+              <w:left w:val="single" w:color="CCCCCC" w:sz="1"/>
+              <w:bottom w:val="single" w:color="CCCCCC" w:sz="1"/>
+              <w:right w:val="single" w:color="CCCCCC" w:sz="1"/>
+            </w:tcBorders>
+            <w:shd w:fill="F0F4FA" w:val="clear"/>
+            <w:tcMar>
+              <w:top w:type="dxa" w:w="80"/>
+              <w:left w:type="dxa" w:w="120"/>
+              <w:bottom w:type="dxa" w:w="80"/>
+              <w:right w:type="dxa" w:w="120"/>
+            </w:tcMar>
+          </w:tcPr>
+          <w:p>
+            <w:r>
+              <w:t xml:space="preserve">Input + output tokens for the full run, including any tool-use loop iterations.</w:t>
+            </w:r>
+          </w:p>
+        </w:tc>
+      </w:tr>
+      <w:tr>
+        <w:tc>
+          <w:tcPr>
+            <w:tcW w:type="dxa" w:w="2400"/>
+            <w:tcBorders>
+              <w:top w:val="single" w:color="CCCCCC" w:sz="1"/>
+              <w:left w:val="single" w:color="CCCCCC" w:sz="1"/>
+              <w:bottom w:val="single" w:color="CCCCCC" w:sz="1"/>
+              <w:right w:val="single" w:color="CCCCCC" w:sz="1"/>
+            </w:tcBorders>
+            <w:shd w:fill="FFFFFF" w:val="clear"/>
+            <w:tcMar>
+              <w:top w:type="dxa" w:w="80"/>
+              <w:left w:type="dxa" w:w="120"/>
+              <w:bottom w:type="dxa" w:w="80"/>
+              <w:right w:type="dxa" w:w="120"/>
+            </w:tcMar>
+          </w:tcPr>
+          <w:p>
+            <w:r>
+              <w:t xml:space="preserve">Cost per request</w:t>
+            </w:r>
+          </w:p>
+        </w:tc>
+        <w:tc>
+          <w:tcPr>
+            <w:tcW w:type="dxa" w:w="7000"/>
+            <w:tcBorders>
+              <w:top w:val="single" w:color="CCCCCC" w:sz="1"/>
+              <w:left w:val="single" w:color="CCCCCC" w:sz="1"/>
+              <w:bottom w:val="single" w:color="CCCCCC" w:sz="1"/>
+              <w:right w:val="single" w:color="CCCCCC" w:sz="1"/>
+            </w:tcBorders>
+            <w:shd w:fill="FFFFFF" w:val="clear"/>
+            <w:tcMar>
+              <w:top w:type="dxa" w:w="80"/>
+              <w:left w:type="dxa" w:w="120"/>
+              <w:bottom w:type="dxa" w:w="80"/>
+              <w:right w:type="dxa" w:w="120"/>
+            </w:tcMar>
+          </w:tcPr>
+          <w:p>
+            <w:r>
+              <w:t xml:space="preserve">Calculated cost in USD based on the model’s published per-token pricing. Displayed per run and aggregated over time.</w:t>
+            </w:r>
+          </w:p>
+        </w:tc>
+      </w:tr>
+      <w:tr>
+        <w:tc>
+          <w:tcPr>
+            <w:tcW w:type="dxa" w:w="2400"/>
+            <w:tcBorders>
+              <w:top w:val="single" w:color="CCCCCC" w:sz="1"/>
+              <w:left w:val="single" w:color="CCCCCC" w:sz="1"/>
+              <w:bottom w:val="single" w:color="CCCCCC" w:sz="1"/>
+              <w:right w:val="single" w:color="CCCCCC" w:sz="1"/>
+            </w:tcBorders>
+            <w:shd w:fill="F0F4FA" w:val="clear"/>
+            <w:tcMar>
+              <w:top w:type="dxa" w:w="80"/>
+              <w:left w:type="dxa" w:w="120"/>
+              <w:bottom w:type="dxa" w:w="80"/>
+              <w:right w:type="dxa" w:w="120"/>
+            </w:tcMar>
+          </w:tcPr>
+          <w:p>
+            <w:r>
+              <w:t xml:space="preserve">Tool calls</w:t>
+            </w:r>
+          </w:p>
+        </w:tc>
+        <w:tc>
+          <w:tcPr>
+            <w:tcW w:type="dxa" w:w="7000"/>
+            <w:tcBorders>
+              <w:top w:val="single" w:color="CCCCCC" w:sz="1"/>
+              <w:left w:val="single" w:color="CCCCCC" w:sz="1"/>
+              <w:bottom w:val="single" w:color="CCCCCC" w:sz="1"/>
+              <w:right w:val="single" w:color="CCCCCC" w:sz="1"/>
+            </w:tcBorders>
+            <w:shd w:fill="F0F4FA" w:val="clear"/>
+            <w:tcMar>
+              <w:top w:type="dxa" w:w="80"/>
+              <w:left w:type="dxa" w:w="120"/>
+              <w:bottom w:type="dxa" w:w="80"/>
+              <w:right w:type="dxa" w:w="120"/>
+            </w:tcMar>
+          </w:tcPr>
+          <w:p>
+            <w:r>
+              <w:t xml:space="preserve">Each MCP tool invocation: tool name, arguments, result, and execution time.</w:t>
+            </w:r>
+          </w:p>
+        </w:tc>
+      </w:tr>
+      <w:tr>
+        <w:tc>
+          <w:tcPr>
+            <w:tcW w:type="dxa" w:w="2400"/>
+            <w:tcBorders>
+              <w:top w:val="single" w:color="CCCCCC" w:sz="1"/>
+              <w:left w:val="single" w:color="CCCCCC" w:sz="1"/>
+              <w:bottom w:val="single" w:color="CCCCCC" w:sz="1"/>
+              <w:right w:val="single" w:color="CCCCCC" w:sz="1"/>
+            </w:tcBorders>
+            <w:shd w:fill="FFFFFF" w:val="clear"/>
+            <w:tcMar>
+              <w:top w:type="dxa" w:w="80"/>
+              <w:left w:type="dxa" w:w="120"/>
+              <w:bottom w:type="dxa" w:w="80"/>
+              <w:right w:type="dxa" w:w="120"/>
+            </w:tcMar>
+          </w:tcPr>
+          <w:p>
+            <w:r>
+              <w:t xml:space="preserve">Errors</w:t>
+            </w:r>
+          </w:p>
+        </w:tc>
+        <w:tc>
+          <w:tcPr>
+            <w:tcW w:type="dxa" w:w="7000"/>
+            <w:tcBorders>
+              <w:top w:val="single" w:color="CCCCCC" w:sz="1"/>
+              <w:left w:val="single" w:color="CCCCCC" w:sz="1"/>
+              <w:bottom w:val="single" w:color="CCCCCC" w:sz="1"/>
+              <w:right w:val="single" w:color="CCCCCC" w:sz="1"/>
+            </w:tcBorders>
+            <w:shd w:fill="FFFFFF" w:val="clear"/>
+            <w:tcMar>
+              <w:top w:type="dxa" w:w="80"/>
+              <w:left w:type="dxa" w:w="120"/>
+              <w:bottom w:type="dxa" w:w="80"/>
+              <w:right w:type="dxa" w:w="120"/>
+            </w:tcMar>
+          </w:tcPr>
+          <w:p>
+            <w:r>
+              <w:t xml:space="preserve">Any exception or timeout in the agent graph, with full stack trace.</w:t>
+            </w:r>
+          </w:p>
+        </w:tc>
+      </w:tr>
+    </w:tbl>
+    <w:p>
+      <w:r>
+        <w:t xml:space="preserve"/>
+      </w:r>
+    </w:p>
+    <w:p>
+      <w:pPr>
+        <w:pStyle w:val="Heading2"/>
+      </w:pPr>
+      <w:r>
+        <w:rPr>
+          <w:color w:val="2E75B6"/>
+        </w:rPr>
+        <w:t xml:space="preserve">10.2 UI Token &amp; Cost Display</w:t>
+      </w:r>
+    </w:p>
+    <w:p>
+      <w:r>
+        <w:t xml:space="preserve">Token usage and cost are surfaced directly in the AI Workbench UI so users and administrators can see the impact of each interaction at a glance. The data flows from LangSmith to the UI via the backend API after each run completes.</w:t>
+      </w:r>
+    </w:p>
+    <w:p>
+      <w:r>
+        <w:t xml:space="preserve"/>
+      </w:r>
+    </w:p>
+    <w:tbl>
+      <w:tblPr>
+        <w:tblW w:type="dxa" w:w="9360"/>
+        <w:tblBorders>
+          <w:top w:val="single" w:color="auto" w:sz="4"/>
+          <w:left w:val="single" w:color="auto" w:sz="4"/>
+          <w:bottom w:val="single" w:color="auto" w:sz="4"/>
+          <w:right w:val="single" w:color="auto" w:sz="4"/>
+          <w:insideH w:val="single" w:color="auto" w:sz="4"/>
+          <w:insideV w:val="single" w:color="auto" w:sz="4"/>
+        </w:tblBorders>
+      </w:tblPr>
+      <w:tblGrid>
+        <w:gridCol w:w="3000"/>
+        <w:gridCol w:w="6360"/>
+      </w:tblGrid>
+      <w:tr>
+        <w:tc>
+          <w:tcPr>
+            <w:tcW w:type="dxa" w:w="3000"/>
+            <w:tcBorders>
+              <w:top w:val="single" w:color="1F4E79" w:sz="1"/>
+              <w:left w:val="single" w:color="1F4E79" w:sz="1"/>
+              <w:bottom w:val="single" w:color="1F4E79" w:sz="1"/>
+              <w:right w:val="single" w:color="1F4E79" w:sz="1"/>
+            </w:tcBorders>
+            <w:shd w:fill="1F4E79" w:val="clear"/>
+            <w:tcMar>
+              <w:top w:type="dxa" w:w="80"/>
+              <w:left w:type="dxa" w:w="120"/>
+              <w:bottom w:type="dxa" w:w="80"/>
+              <w:right w:type="dxa" w:w="120"/>
+            </w:tcMar>
+          </w:tcPr>
+          <w:p>
+            <w:r>
+              <w:rPr>
+                <w:b/>
+                <w:bCs/>
+                <w:color w:val="FFFFFF"/>
+              </w:rPr>
+              <w:t xml:space="preserve">UI location</w:t>
+            </w:r>
+          </w:p>
+        </w:tc>
+        <w:tc>
+          <w:tcPr>
+            <w:tcW w:type="dxa" w:w="6360"/>
+            <w:tcBorders>
+              <w:top w:val="single" w:color="1F4E79" w:sz="1"/>
+              <w:left w:val="single" w:color="1F4E79" w:sz="1"/>
+              <w:bottom w:val="single" w:color="1F4E79" w:sz="1"/>
+              <w:right w:val="single" w:color="1F4E79" w:sz="1"/>
+            </w:tcBorders>
+            <w:shd w:fill="1F4E79" w:val="clear"/>
+            <w:tcMar>
+              <w:top w:type="dxa" w:w="80"/>
+              <w:left w:type="dxa" w:w="120"/>
+              <w:bottom w:type="dxa" w:w="80"/>
+              <w:right w:type="dxa" w:w="120"/>
+            </w:tcMar>
+          </w:tcPr>
+          <w:p>
+            <w:r>
+              <w:rPr>
+                <w:b/>
+                <w:bCs/>
+                <w:color w:val="FFFFFF"/>
+              </w:rPr>
+              <w:t xml:space="preserve">What is shown</w:t>
+            </w:r>
+          </w:p>
+        </w:tc>
+      </w:tr>
+      <w:tr>
+        <w:tc>
+          <w:tcPr>
+            <w:tcW w:type="dxa" w:w="3000"/>
+            <w:tcBorders>
+              <w:top w:val="single" w:color="CCCCCC" w:sz="1"/>
+              <w:left w:val="single" w:color="CCCCCC" w:sz="1"/>
+              <w:bottom w:val="single" w:color="CCCCCC" w:sz="1"/>
+              <w:right w:val="single" w:color="CCCCCC" w:sz="1"/>
+            </w:tcBorders>
+            <w:shd w:fill="F0F4FA" w:val="clear"/>
+            <w:tcMar>
+              <w:top w:type="dxa" w:w="80"/>
+              <w:left w:type="dxa" w:w="120"/>
+              <w:bottom w:type="dxa" w:w="80"/>
+              <w:right w:type="dxa" w:w="120"/>
+            </w:tcMar>
+          </w:tcPr>
+          <w:p>
+            <w:r>
+              <w:t xml:space="preserve">Chat message footer</w:t>
+            </w:r>
+          </w:p>
+        </w:tc>
+        <w:tc>
+          <w:tcPr>
+            <w:tcW w:type="dxa" w:w="6360"/>
+            <w:tcBorders>
+              <w:top w:val="single" w:color="CCCCCC" w:sz="1"/>
+              <w:left w:val="single" w:color="CCCCCC" w:sz="1"/>
+              <w:bottom w:val="single" w:color="CCCCCC" w:sz="1"/>
+              <w:right w:val="single" w:color="CCCCCC" w:sz="1"/>
+            </w:tcBorders>
+            <w:shd w:fill="F0F4FA" w:val="clear"/>
+            <w:tcMar>
+              <w:top w:type="dxa" w:w="80"/>
+              <w:left w:type="dxa" w:w="120"/>
+              <w:bottom w:type="dxa" w:w="80"/>
+              <w:right w:type="dxa" w:w="120"/>
+            </w:tcMar>
+          </w:tcPr>
+          <w:p>
+            <w:r>
+              <w:t xml:space="preserve">Input tokens / Output tokens / Total tokens for that response. Example: “↑ 412 tokens  ↓ 318 tokens  ≈ $0.0023”</w:t>
+            </w:r>
+          </w:p>
+        </w:tc>
+      </w:tr>
+      <w:tr>
+        <w:tc>
+          <w:tcPr>
+            <w:tcW w:type="dxa" w:w="3000"/>
+            <w:tcBorders>
+              <w:top w:val="single" w:color="CCCCCC" w:sz="1"/>
+              <w:left w:val="single" w:color="CCCCCC" w:sz="1"/>
+              <w:bottom w:val="single" w:color="CCCCCC" w:sz="1"/>
+              <w:right w:val="single" w:color="CCCCCC" w:sz="1"/>
+            </w:tcBorders>
+            <w:shd w:fill="FFFFFF" w:val="clear"/>
+            <w:tcMar>
+              <w:top w:type="dxa" w:w="80"/>
+              <w:left w:type="dxa" w:w="120"/>
+              <w:bottom w:type="dxa" w:w="80"/>
+              <w:right w:type="dxa" w:w="120"/>
+            </w:tcMar>
+          </w:tcPr>
+          <w:p>
+            <w:r>
+              <w:t xml:space="preserve">Run detail panel</w:t>
+            </w:r>
+          </w:p>
+        </w:tc>
+        <w:tc>
+          <w:tcPr>
+            <w:tcW w:type="dxa" w:w="6360"/>
+            <w:tcBorders>
+              <w:top w:val="single" w:color="CCCCCC" w:sz="1"/>
+              <w:left w:val="single" w:color="CCCCCC" w:sz="1"/>
+              <w:bottom w:val="single" w:color="CCCCCC" w:sz="1"/>
+              <w:right w:val="single" w:color="CCCCCC" w:sz="1"/>
+            </w:tcBorders>
+            <w:shd w:fill="FFFFFF" w:val="clear"/>
+            <w:tcMar>
+              <w:top w:type="dxa" w:w="80"/>
+              <w:left w:type="dxa" w:w="120"/>
+              <w:bottom w:type="dxa" w:w="80"/>
+              <w:right w:type="dxa" w:w="120"/>
+            </w:tcMar>
+          </w:tcPr>
+          <w:p>
+            <w:r>
+              <w:t xml:space="preserve">Full token breakdown per LLM call within the run (useful when the agent loops on tool calls).</w:t>
+            </w:r>
+          </w:p>
+        </w:tc>
+      </w:tr>
+      <w:tr>
+        <w:tc>
+          <w:tcPr>
+            <w:tcW w:type="dxa" w:w="3000"/>
+            <w:tcBorders>
+              <w:top w:val="single" w:color="CCCCCC" w:sz="1"/>
+              <w:left w:val="single" w:color="CCCCCC" w:sz="1"/>
+              <w:bottom w:val="single" w:color="CCCCCC" w:sz="1"/>
+              <w:right w:val="single" w:color="CCCCCC" w:sz="1"/>
+            </w:tcBorders>
+            <w:shd w:fill="F0F4FA" w:val="clear"/>
+            <w:tcMar>
+              <w:top w:type="dxa" w:w="80"/>
+              <w:left w:type="dxa" w:w="120"/>
+              <w:bottom w:type="dxa" w:w="80"/>
+              <w:right w:type="dxa" w:w="120"/>
+            </w:tcMar>
+          </w:tcPr>
+          <w:p>
+            <w:r>
+              <w:t xml:space="preserve">Admin dashboard</w:t>
+            </w:r>
+          </w:p>
+        </w:tc>
+        <w:tc>
+          <w:tcPr>
+            <w:tcW w:type="dxa" w:w="6360"/>
+            <w:tcBorders>
+              <w:top w:val="single" w:color="CCCCCC" w:sz="1"/>
+              <w:left w:val="single" w:color="CCCCCC" w:sz="1"/>
+              <w:bottom w:val="single" w:color="CCCCCC" w:sz="1"/>
+              <w:right w:val="single" w:color="CCCCCC" w:sz="1"/>
+            </w:tcBorders>
+            <w:shd w:fill="F0F4FA" w:val="clear"/>
+            <w:tcMar>
+              <w:top w:type="dxa" w:w="80"/>
+              <w:left w:type="dxa" w:w="120"/>
+              <w:bottom w:type="dxa" w:w="80"/>
+              <w:right w:type="dxa" w:w="120"/>
+            </w:tcMar>
+          </w:tcPr>
+          <w:p>
+            <w:r>
+              <w:t xml:space="preserve">Daily and monthly token consumption and cost, grouped by model, skill, and user.</w:t>
+            </w:r>
+          </w:p>
+        </w:tc>
+      </w:tr>
+      <w:tr>
+        <w:tc>
+          <w:tcPr>
+            <w:tcW w:type="dxa" w:w="3000"/>
+            <w:tcBorders>
+              <w:top w:val="single" w:color="CCCCCC" w:sz="1"/>
+              <w:left w:val="single" w:color="CCCCCC" w:sz="1"/>
+              <w:bottom w:val="single" w:color="CCCCCC" w:sz="1"/>
+              <w:right w:val="single" w:color="CCCCCC" w:sz="1"/>
+            </w:tcBorders>
+            <w:shd w:fill="FFFFFF" w:val="clear"/>
+            <w:tcMar>
+              <w:top w:type="dxa" w:w="80"/>
+              <w:left w:type="dxa" w:w="120"/>
+              <w:bottom w:type="dxa" w:w="80"/>
+              <w:right w:type="dxa" w:w="120"/>
+            </w:tcMar>
+          </w:tcPr>
+          <w:p>
+            <w:r>
+              <w:t xml:space="preserve">Agent run log (MongoDB)</w:t>
+            </w:r>
+          </w:p>
+        </w:tc>
+        <w:tc>
+          <w:tcPr>
+            <w:tcW w:type="dxa" w:w="6360"/>
+            <w:tcBorders>
+              <w:top w:val="single" w:color="CCCCCC" w:sz="1"/>
+              <w:left w:val="single" w:color="CCCCCC" w:sz="1"/>
+              <w:bottom w:val="single" w:color="CCCCCC" w:sz="1"/>
+              <w:right w:val="single" w:color="CCCCCC" w:sz="1"/>
+            </w:tcBorders>
+            <w:shd w:fill="FFFFFF" w:val="clear"/>
+            <w:tcMar>
+              <w:top w:type="dxa" w:w="80"/>
+              <w:left w:type="dxa" w:w="120"/>
+              <w:bottom w:type="dxa" w:w="80"/>
+              <w:right w:type="dxa" w:w="120"/>
+            </w:tcMar>
+          </w:tcPr>
+          <w:p>
+            <w:r>
+              <w:t xml:space="preserve">Tokens and cost are persisted in the agent_runs collection for offline reporting.</w:t>
+            </w:r>
+          </w:p>
+        </w:tc>
+      </w:tr>
+    </w:tbl>
+    <w:p>
+      <w:r>
+        <w:t xml:space="preserve"/>
+      </w:r>
+    </w:p>
+    <w:p>
+      <w:pPr>
+        <w:pStyle w:val="Heading2"/>
+      </w:pPr>
+      <w:r>
+        <w:rPr>
+          <w:color w:val="2E75B6"/>
+        </w:rPr>
+        <w:t xml:space="preserve">10.3 Integration Notes</w:t>
+      </w:r>
+    </w:p>
+    <w:p>
+      <w:pPr>
+        <w:pStyle w:val="ListParagraph"/>
+        <w:numPr>
+          <w:ilvl w:val="0"/>
+          <w:numId w:val="2"/>
+        </w:numPr>
+      </w:pPr>
+      <w:r>
+        <w:t xml:space="preserve">Set LANGCHAIN_TRACING_V2=true and LANGCHAIN_API_KEY in the backend environment to enable tracing. No changes to agent or skill code are required.</w:t>
+      </w:r>
+    </w:p>
+    <w:p>
+      <w:pPr>
+        <w:pStyle w:val="ListParagraph"/>
+        <w:numPr>
+          <w:ilvl w:val="0"/>
+          <w:numId w:val="2"/>
+        </w:numPr>
+      </w:pPr>
+      <w:r>
+        <w:t xml:space="preserve">The LangSmith project name maps to the environment (e.g. ai-workbench-prod, ai-workbench-staging) so traces from different deployments are separated.</w:t>
+      </w:r>
+    </w:p>
+    <w:p>
+      <w:pPr>
+        <w:pStyle w:val="ListParagraph"/>
+        <w:numPr>
+          <w:ilvl w:val="0"/>
+          <w:numId w:val="2"/>
+        </w:numPr>
+      </w:pPr>
+      <w:r>
+        <w:t xml:space="preserve">Token counts and cost are returned by LangSmith in the run metadata and stored in the agent_runs MongoDB collection alongside the existing step log.</w:t>
+      </w:r>
+    </w:p>
+    <w:p>
+      <w:pPr>
+        <w:pStyle w:val="ListParagraph"/>
+        <w:numPr>
+          <w:ilvl w:val="0"/>
+          <w:numId w:val="2"/>
+        </w:numPr>
+      </w:pPr>
+      <w:r>
+        <w:t xml:space="preserve">For offline or airgapped deployments, LangSmith Self-Hosted can be used in place of the cloud service with no changes to the tracing code.</w:t>
+      </w:r>
+    </w:p>
+    <w:p>
+      <w:r>
+        <w:t xml:space="preserve"/>
+      </w:r>
+    </w:p>
+    <w:p>
+      <w:pPr>
+        <w:pBdr>
+          <w:bottom w:val="single" w:color="2E75B6" w:sz="6" w:space="1"/>
+        </w:pBdr>
+      </w:pPr>
+      <w:r>
+        <w:t xml:space="preserve"/>
+      </w:r>
+    </w:p>
+    <w:p>
+      <w:pPr>
+        <w:pStyle w:val="Heading1"/>
+      </w:pPr>
+      <w:r>
+        <w:rPr>
+          <w:color w:val="1F4E79"/>
+        </w:rPr>
+        <w:t xml:space="preserve">11. Implementation Roadmap</w:t>
       </w:r>
     </w:p>
     <w:tbl>
@@ -4960,7 +5934,7 @@
           </w:tcPr>
           <w:p>
             <w:r>
-              <w:t xml:space="preserve">Backend API, MongoDB integration, LLM Gateway, Skill Registry, 2 starter skills</w:t>
+              <w:t xml:space="preserve">TypeScript/Node.js backend, MongoDB integration, LiteLLM gateway, Skill Registry, LangSmith tracing, 2 starter skills</w:t>
             </w:r>
           </w:p>
         </w:tc>
@@ -5054,7 +6028,7 @@
           </w:tcPr>
           <w:p>
             <w:r>
-              <w:t xml:space="preserve">Agent Runner, MCP Registry, initial MCP server integrations, streaming responses</w:t>
+              <w:t xml:space="preserve">LangGraph agent runner, MCP Registry, initial MCP server integrations, LangChain RAG pipeline, streaming responses</w:t>
             </w:r>
           </w:p>
         </w:tc>
@@ -5482,7 +6456,7 @@
         <w:rPr>
           <w:color w:val="1F4E79"/>
         </w:rPr>
-        <w:t xml:space="preserve">11. Security Considerations</w:t>
+        <w:t xml:space="preserve">12. Security Considerations</w:t>
       </w:r>
     </w:p>
     <w:p>
@@ -5568,7 +6542,7 @@
         <w:rPr>
           <w:color w:val="1F4E79"/>
         </w:rPr>
-        <w:t xml:space="preserve">12. Recommended Next Steps</w:t>
+        <w:t xml:space="preserve">13. Recommended Next Steps</w:t>
       </w:r>
     </w:p>
     <w:p>

</xml_diff>